<commit_message>
examples: Word-compatible anonymized docx (figures blanked, structure intact)
</commit_message>
<xml_diff>
--- a/examples/bakery-fleet-requirements/input/vision-scope-document.docx
+++ b/examples/bakery-fleet-requirements/input/vision-scope-document.docx
@@ -3053,9 +3053,54 @@
         <w:rPr>
           <w:noProof/>
         </w:rPr>
-      </w:r>
-      <w:r>
-        <w:t>[figure removed in anonymized copy]</w:t>
+        <w:drawing>
+          <wp:inline distT="0" distB="0" distL="0" distR="0">
+            <wp:extent cx="3271651" cy="2043687"/>
+            <wp:effectExtent l="0" t="0" r="5080" b="0"/>
+            <wp:docPr id="1" name="Picture 1" descr="D:\sd_touch_panel_low.jpg"/>
+            <wp:cNvGraphicFramePr>
+              <a:graphicFrameLocks xmlns:a="http://schemas.openxmlformats.org/drawingml/2006/main" noChangeAspect="1"/>
+            </wp:cNvGraphicFramePr>
+            <a:graphic xmlns:a="http://schemas.openxmlformats.org/drawingml/2006/main">
+              <a:graphicData uri="http://schemas.openxmlformats.org/drawingml/2006/picture">
+                <pic:pic xmlns:pic="http://schemas.openxmlformats.org/drawingml/2006/picture">
+                  <pic:nvPicPr>
+                    <pic:cNvPr id="0" name="Picture 1" descr="D:\sd_touch_panel_low.jpg"/>
+                    <pic:cNvPicPr>
+                      <a:picLocks noChangeAspect="1" noChangeArrowheads="1"/>
+                    </pic:cNvPicPr>
+                  </pic:nvPicPr>
+                  <pic:blipFill>
+                    <a:blip r:embed="rId11" cstate="print">
+                      <a:extLst>
+                        <a:ext uri="{28A0092B-C50C-407E-A947-70E740481C1C}">
+                          <a14:useLocalDpi xmlns:a14="http://schemas.microsoft.com/office/drawing/2010/main" val="0"/>
+                        </a:ext>
+                      </a:extLst>
+                    </a:blip>
+                    <a:srcRect/>
+                    <a:stretch>
+                      <a:fillRect/>
+                    </a:stretch>
+                  </pic:blipFill>
+                  <pic:spPr bwMode="auto">
+                    <a:xfrm>
+                      <a:off x="0" y="0"/>
+                      <a:ext cx="3286158" cy="2052749"/>
+                    </a:xfrm>
+                    <a:prstGeom prst="rect">
+                      <a:avLst/>
+                    </a:prstGeom>
+                    <a:noFill/>
+                    <a:ln>
+                      <a:noFill/>
+                    </a:ln>
+                  </pic:spPr>
+                </pic:pic>
+              </a:graphicData>
+            </a:graphic>
+          </wp:inline>
+        </w:drawing>
       </w:r>
     </w:p>
     <w:p/>
@@ -3085,9 +3130,54 @@
         <w:rPr>
           <w:noProof/>
         </w:rPr>
-      </w:r>
-      <w:r>
-        <w:t>[figure removed in anonymized copy]</w:t>
+        <w:drawing>
+          <wp:inline distT="0" distB="0" distL="0" distR="0">
+            <wp:extent cx="3078537" cy="2505694"/>
+            <wp:effectExtent l="0" t="0" r="7620" b="9525"/>
+            <wp:docPr id="2" name="Picture 2" descr="D:\sd_touch_panel_low_UI.jpg"/>
+            <wp:cNvGraphicFramePr>
+              <a:graphicFrameLocks xmlns:a="http://schemas.openxmlformats.org/drawingml/2006/main" noChangeAspect="1"/>
+            </wp:cNvGraphicFramePr>
+            <a:graphic xmlns:a="http://schemas.openxmlformats.org/drawingml/2006/main">
+              <a:graphicData uri="http://schemas.openxmlformats.org/drawingml/2006/picture">
+                <pic:pic xmlns:pic="http://schemas.openxmlformats.org/drawingml/2006/picture">
+                  <pic:nvPicPr>
+                    <pic:cNvPr id="0" name="Picture 2" descr="D:\sd_touch_panel_low_UI.jpg"/>
+                    <pic:cNvPicPr>
+                      <a:picLocks noChangeAspect="1" noChangeArrowheads="1"/>
+                    </pic:cNvPicPr>
+                  </pic:nvPicPr>
+                  <pic:blipFill>
+                    <a:blip r:embed="rId12" cstate="print">
+                      <a:extLst>
+                        <a:ext uri="{28A0092B-C50C-407E-A947-70E740481C1C}">
+                          <a14:useLocalDpi xmlns:a14="http://schemas.microsoft.com/office/drawing/2010/main" val="0"/>
+                        </a:ext>
+                      </a:extLst>
+                    </a:blip>
+                    <a:srcRect/>
+                    <a:stretch>
+                      <a:fillRect/>
+                    </a:stretch>
+                  </pic:blipFill>
+                  <pic:spPr bwMode="auto">
+                    <a:xfrm>
+                      <a:off x="0" y="0"/>
+                      <a:ext cx="3089114" cy="2514303"/>
+                    </a:xfrm>
+                    <a:prstGeom prst="rect">
+                      <a:avLst/>
+                    </a:prstGeom>
+                    <a:noFill/>
+                    <a:ln>
+                      <a:noFill/>
+                    </a:ln>
+                  </pic:spPr>
+                </pic:pic>
+              </a:graphicData>
+            </a:graphic>
+          </wp:inline>
+        </w:drawing>
       </w:r>
     </w:p>
     <w:p/>

</xml_diff>